<commit_message>
test(convert): update expected for pandoc-3.8.3
</commit_message>
<xml_diff>
--- a/tests/func/test_convert_syntax_markdown.out.docx
+++ b/tests/func/test_convert_syntax_markdown.out.docx
@@ -28,7 +28,7 @@
       <w:r>
         <w:t xml:space="preserve"> </w:t>
       </w:r>
-      <w:hyperlink r:id="rId20">
+      <w:hyperlink r:id="rId9">
         <w:r>
           <w:rPr>
             <w:rStyle w:val="Hyperlink"/>
@@ -366,7 +366,7 @@
       <w:pPr>
         <w:pStyle w:val="BodyText"/>
       </w:pPr>
-      <w:hyperlink r:id="rId21">
+      <w:hyperlink r:id="rId10">
         <w:r>
           <w:rPr>
             <w:rStyle w:val="Hyperlink"/>
@@ -431,7 +431,7 @@
           <w:numId w:val="1001"/>
         </w:numPr>
       </w:pPr>
-      <w:hyperlink r:id="rId22">
+      <w:hyperlink r:id="rId11">
         <w:r>
           <w:rPr>
             <w:rStyle w:val="Hyperlink"/>
@@ -448,7 +448,7 @@
           <w:numId w:val="1001"/>
         </w:numPr>
       </w:pPr>
-      <w:hyperlink r:id="rId23">
+      <w:hyperlink r:id="rId12">
         <w:r>
           <w:rPr>
             <w:rStyle w:val="Hyperlink"/>
@@ -612,8 +612,8 @@
         <w:t xml:space="preserve">House of Dude</w:t>
       </w:r>
     </w:p>
-    <w:bookmarkStart w:id="26" w:name="refs"/>
-    <w:bookmarkStart w:id="24" w:name="ref-bloggs-jones"/>
+    <w:bookmarkStart w:id="15" w:name="refs"/>
+    <w:bookmarkStart w:id="13" w:name="ref-bloggs-jones"/>
     <w:p>
       <w:pPr>
         <w:pStyle w:val="Bibliography"/>
@@ -641,8 +641,8 @@
         <w:t xml:space="preserve">.</w:t>
       </w:r>
     </w:p>
-    <w:bookmarkEnd w:id="24"/>
-    <w:bookmarkStart w:id="25" w:name="ref-chomsky-73"/>
+    <w:bookmarkEnd w:id="13"/>
+    <w:bookmarkStart w:id="14" w:name="ref-chomsky-73"/>
     <w:p>
       <w:pPr>
         <w:pStyle w:val="Bibliography"/>
@@ -673,11 +673,11 @@
         <w:t xml:space="preserve">A Festschrift for Morris Halle</w:t>
       </w:r>
       <w:r>
-        <w:t xml:space="preserve">, edited by S. R. Anderson and P. Kiparsky. New York: Holt, Rinehart &amp; Winston.</w:t>
+        <w:t xml:space="preserve">, edited by S. R. Anderson and P. Kiparsky. Holt, Rinehart &amp; Winston.</w:t>
       </w:r>
     </w:p>
-    <w:bookmarkEnd w:id="25"/>
-    <w:bookmarkEnd w:id="26"/>
+    <w:bookmarkEnd w:id="14"/>
+    <w:bookmarkEnd w:id="15"/>
     <w:sectPr>
       <w:pgSz w:h="12240" w:orient="landscape" w:w="15840"/>
       <w:pgMar w:bottom="720" w:footer="720" w:gutter="0" w:header="720" w:left="720" w:right="720" w:top="720"/>

</xml_diff>